<commit_message>
Renumber the classifier SHAP supplement to Supplementary Figure 4
Renames the SHAP generator and its source data, repoints the docs, README
and figure-structure table, and refreshes the regenerated figure exports.

Committed from the working tree as inherited on this branch; the
supplementary-video work in the following commit is separate.

Co-Authored-By: Claude Opus 5 <noreply@anthropic.com>
</commit_message>
<xml_diff>
--- a/report/Sanguino-Gómez_coping_strategies_Nature_Neuroscience_highlighted.docx
+++ b/report/Sanguino-Gómez_coping_strategies_Nature_Neuroscience_highlighted.docx
@@ -6150,33 +6150,37 @@
         <w:rPr>
           <w:b w:val="0"/>
         </w:rPr>
-        <w:t xml:space="preserve"> (</w:t>
-      </w:r>
-      <w:r>
-        <w:rPr>
-          <w:b w:val="0"/>
-          <w:highlight w:val="yellow"/>
-        </w:rPr>
-        <w:t xml:space="preserve">Supplementary </w:t>
-      </w:r>
-      <w:r>
-        <w:rPr>
-          <w:b w:val="0"/>
-        </w:rPr>
-        <w:t xml:space="preserve">Fig. </w:t>
-      </w:r>
-      <w:r>
-        <w:rPr>
-          <w:b w:val="0"/>
-          <w:highlight w:val="yellow"/>
-        </w:rPr>
-        <w:t>5A–H</w:t>
-      </w:r>
-      <w:r>
-        <w:rPr>
-          <w:b w:val="0"/>
-        </w:rPr>
-        <w:t xml:space="preserve">). These profiles </w:t>
+        <w:t xml:space="preserve"> </w:t>
+      </w:r>
+      <w:r>
+        <w:rPr>
+          <w:b w:val="0"/>
+          <w:highlight w:val="green"/>
+        </w:rPr>
+        <w:t>(Supplementary Fig. 4A–H)</w:t>
+      </w:r>
+      <w:r>
+        <w:rPr>
+          <w:b w:val="0"/>
+          <w:highlight w:val="yellow"/>
+        </w:rPr>
+      </w:r>
+      <w:r>
+        <w:rPr>
+          <w:b w:val="0"/>
+        </w:rPr>
+      </w:r>
+      <w:r>
+        <w:rPr>
+          <w:b w:val="0"/>
+          <w:highlight w:val="yellow"/>
+        </w:rPr>
+      </w:r>
+      <w:r>
+        <w:rPr>
+          <w:b w:val="0"/>
+        </w:rPr>
+        <w:t xml:space="preserve">. These profiles </w:t>
       </w:r>
       <w:r>
         <w:rPr>
@@ -7329,46 +7333,48 @@
           <w:b w:val="0"/>
           <w:highlight w:val="yellow"/>
         </w:rPr>
-        <w:t>was higher, and Markov entropy was unchanged. When the vulnerable subgroup was analyzed separately, however, it showed significantly lower Simpson diversity and Lempel–Ziv complexity</w:t>
-      </w:r>
-      <w:r>
-        <w:rPr>
-          <w:b w:val="0"/>
-        </w:rPr>
-        <w:t xml:space="preserve">, higher </w:t>
-      </w:r>
-      <w:r>
-        <w:rPr>
-          <w:b w:val="0"/>
-          <w:highlight w:val="yellow"/>
-        </w:rPr>
-        <w:t>recurrence</w:t>
-      </w:r>
-      <w:r>
-        <w:rPr>
-          <w:b w:val="0"/>
-        </w:rPr>
-        <w:t xml:space="preserve"> and </w:t>
-      </w:r>
-      <w:r>
-        <w:rPr>
-          <w:b w:val="0"/>
-          <w:highlight w:val="yellow"/>
-        </w:rPr>
-        <w:t>determinism, and lower</w:t>
-      </w:r>
-      <w:r>
-        <w:rPr>
-          <w:b w:val="0"/>
-        </w:rPr>
-        <w:t xml:space="preserve"> Markov entropy </w:t>
-      </w:r>
-      <w:r>
-        <w:rPr>
-          <w:b w:val="0"/>
-          <w:highlight w:val="yellow"/>
-        </w:rPr>
-        <w:t>than controls. This concentration of effects in vulnerable animals supports behavioral rigidity rather than</w:t>
+        <w:t xml:space="preserve">was higher, and Markov entropy was unchanged. </w:t>
+      </w:r>
+      <w:r>
+        <w:rPr>
+          <w:b w:val="0"/>
+          <w:highlight w:val="green"/>
+        </w:rPr>
+        <w:t>When the vulnerable subgroup was analyzed separately, however, it showed significantly lower Simpson diversity and higher recurrence than controls, together with nominally higher determinism and a trend toward lower Lempel–Ziv complexity; Markov entropy did not differ significantly.</w:t>
+      </w:r>
+      <w:r>
+        <w:rPr>
+          <w:b w:val="0"/>
+        </w:rPr>
+      </w:r>
+      <w:r>
+        <w:rPr>
+          <w:b w:val="0"/>
+          <w:highlight w:val="yellow"/>
+        </w:rPr>
+      </w:r>
+      <w:r>
+        <w:rPr>
+          <w:b w:val="0"/>
+        </w:rPr>
+      </w:r>
+      <w:r>
+        <w:rPr>
+          <w:b w:val="0"/>
+          <w:highlight w:val="yellow"/>
+        </w:rPr>
+      </w:r>
+      <w:r>
+        <w:rPr>
+          <w:b w:val="0"/>
+        </w:rPr>
+      </w:r>
+      <w:r>
+        <w:rPr>
+          <w:b w:val="0"/>
+          <w:highlight w:val="yellow"/>
+        </w:rPr>
+        <w:t xml:space="preserve"> This concentration of effects in vulnerable animals supports behavioral rigidity rather than</w:t>
       </w:r>
       <w:r>
         <w:rPr>
@@ -9496,23 +9502,30 @@
           <w:rFonts w:ascii="Aptos" w:hAnsi="Aptos"/>
           <w:color w:val="4D4D4D"/>
         </w:rPr>
-        <w:t>During the visual inspection, we observed that climbing behavior could not be reliably captured by keypoint MoSeq’s predictions in its default configuration, likely due to the inherent limitations of two-dimensional top-down video in representing vertical movements. To isolate climbing events, we generated a binary mask separating the floor and walls of the cage based on manually annotated corner points from the median background frame of each video. For each frame, we then computed the convex hull of the animal’s DeepLabCut keypoints and quantified the fraction of its area overlapping with the floor (</w:t>
-      </w:r>
-      <w:r>
-        <w:rPr>
-          <w:rFonts w:ascii="Aptos" w:hAnsi="Aptos"/>
-          <w:b/>
-          <w:bCs/>
-          <w:color w:val="4D4D4D"/>
-        </w:rPr>
-        <w:t>Supplementary Figure 4</w:t>
-      </w:r>
-      <w:r>
-        <w:rPr>
-          <w:rFonts w:ascii="Aptos" w:hAnsi="Aptos"/>
-          <w:color w:val="4D4D4D"/>
-        </w:rPr>
-        <w:t xml:space="preserve">). Frames with a floor-overlap ratio </w:t>
+        <w:t xml:space="preserve">During the visual inspection, we observed that climbing behavior could not be reliably captured by keypoint MoSeq’s predictions in its default configuration, likely due to the inherent limitations of two-dimensional top-down video in representing vertical movements. To isolate climbing events, we generated a binary mask separating the floor and walls of the cage based on manually annotated corner points from the median background frame of each video. For each frame, we then computed the convex hull of the animal’s DeepLabCut keypoints and quantified the fraction of its area overlapping with the floor </w:t>
+      </w:r>
+      <w:r>
+        <w:rPr>
+          <w:rFonts w:ascii="Aptos" w:hAnsi="Aptos"/>
+          <w:color w:val="4D4D4D"/>
+          <w:highlight w:val="green"/>
+        </w:rPr>
+        <w:t>(Supplementary Figure 5)</w:t>
+      </w:r>
+      <w:r>
+        <w:rPr>
+          <w:rFonts w:ascii="Aptos" w:hAnsi="Aptos"/>
+          <w:b/>
+          <w:bCs/>
+          <w:color w:val="4D4D4D"/>
+        </w:rPr>
+      </w:r>
+      <w:r>
+        <w:rPr>
+          <w:rFonts w:ascii="Aptos" w:hAnsi="Aptos"/>
+          <w:color w:val="4D4D4D"/>
+        </w:rPr>
+        <w:t xml:space="preserve">. Frames with a floor-overlap ratio </w:t>
       </w:r>
       <w:r>
         <w:rPr>
@@ -14841,20 +14854,26 @@
           <w:b w:val="0"/>
           <w:highlight w:val="yellow"/>
         </w:rPr>
-        <w:t>10 of 719 candidate parameters for each behavior (Supplementary Fig</w:t>
-      </w:r>
-      <w:r>
-        <w:rPr>
-          <w:b w:val="0"/>
-        </w:rPr>
-        <w:t>.</w:t>
-      </w:r>
-      <w:r>
-        <w:rPr>
-          <w:b w:val="0"/>
-          <w:highlight w:val="yellow"/>
-        </w:rPr>
-        <w:t xml:space="preserve"> 5). Each point represents a sampled frame, its horizontal position is the</w:t>
+        <w:t xml:space="preserve">10 of 719 candidate parameters for each behavior </w:t>
+      </w:r>
+      <w:r>
+        <w:rPr>
+          <w:b w:val="0"/>
+          <w:highlight w:val="green"/>
+        </w:rPr>
+        <w:t>(Supplementary Fig. 4)</w:t>
+      </w:r>
+      <w:r>
+        <w:rPr>
+          <w:b w:val="0"/>
+        </w:rPr>
+      </w:r>
+      <w:r>
+        <w:rPr>
+          <w:b w:val="0"/>
+          <w:highlight w:val="yellow"/>
+        </w:rPr>
+        <w:t>. Each point represents a sampled frame, its horizontal position is the</w:t>
       </w:r>
       <w:r>
         <w:rPr>
@@ -19203,27 +19222,125 @@
         <w:rPr>
           <w:color w:val="4D4D4D"/>
         </w:rPr>
-        <w:t xml:space="preserve">. Boxplot of the Simpson diversity index (mean ± SEM). ELS </w:t>
-      </w:r>
-      <w:r>
-        <w:rPr>
-          <w:color w:val="4D4D4D"/>
-          <w:highlight w:val="yellow"/>
-        </w:rPr>
-        <w:t>showed a trend toward lower</w:t>
-      </w:r>
-      <w:r>
-        <w:rPr>
-          <w:color w:val="4D4D4D"/>
-        </w:rPr>
-        <w:t xml:space="preserve"> behavioral motif diversity</w:t>
-      </w:r>
-      <w:r>
-        <w:rPr>
-          <w:color w:val="4D4D4D"/>
-          <w:highlight w:val="yellow"/>
-        </w:rPr>
-        <w:t xml:space="preserve"> (p = 0.055)</w:t>
+        <w:t xml:space="preserve">. Boxplot of the Simpson diversity index (mean ± SEM). </w:t>
+      </w:r>
+      <w:r>
+        <w:rPr>
+          <w:color w:val="4D4D4D"/>
+          <w:highlight w:val="green"/>
+        </w:rPr>
+        <w:t>ELS showed a trend toward lower behavioral motif diversity (p = 0.058).</w:t>
+      </w:r>
+      <w:r>
+        <w:rPr>
+          <w:color w:val="4D4D4D"/>
+          <w:highlight w:val="yellow"/>
+        </w:rPr>
+      </w:r>
+      <w:r>
+        <w:rPr>
+          <w:color w:val="4D4D4D"/>
+        </w:rPr>
+      </w:r>
+      <w:r>
+        <w:rPr>
+          <w:color w:val="4D4D4D"/>
+          <w:highlight w:val="yellow"/>
+        </w:rPr>
+      </w:r>
+      <w:r>
+        <w:rPr>
+          <w:color w:val="4D4D4D"/>
+        </w:rPr>
+        <w:t xml:space="preserve"> </w:t>
+      </w:r>
+      <w:r>
+        <w:rPr>
+          <w:b/>
+          <w:bCs/>
+          <w:color w:val="4D4D4D"/>
+        </w:rPr>
+        <w:t>F</w:t>
+      </w:r>
+      <w:r>
+        <w:rPr>
+          <w:color w:val="4D4D4D"/>
+        </w:rPr>
+        <w:t xml:space="preserve">. Boxplot of the Shannon diversity index (mean ± SEM). No difference between groups. </w:t>
+      </w:r>
+      <w:r>
+        <w:rPr>
+          <w:b/>
+          <w:bCs/>
+          <w:color w:val="4D4D4D"/>
+        </w:rPr>
+        <w:t>G</w:t>
+      </w:r>
+      <w:r>
+        <w:rPr>
+          <w:color w:val="4D4D4D"/>
+        </w:rPr>
+        <w:t xml:space="preserve">. Boxplot of the evenness index (mean ± SEM). Evenness is comparable across groups. </w:t>
+      </w:r>
+      <w:r>
+        <w:rPr>
+          <w:b/>
+          <w:bCs/>
+          <w:color w:val="4D4D4D"/>
+        </w:rPr>
+        <w:t>H</w:t>
+      </w:r>
+      <w:r>
+        <w:rPr>
+          <w:color w:val="4D4D4D"/>
+        </w:rPr>
+        <w:t xml:space="preserve">. Boxplot of the cumulative usage index (mean ± SEM). ELS </w:t>
+      </w:r>
+      <w:r>
+        <w:rPr>
+          <w:color w:val="4D4D4D"/>
+          <w:highlight w:val="yellow"/>
+        </w:rPr>
+        <w:t>increased</w:t>
+      </w:r>
+      <w:r>
+        <w:rPr>
+          <w:color w:val="4D4D4D"/>
+        </w:rPr>
+        <w:t xml:space="preserve"> </w:t>
+      </w:r>
+      <w:r>
+        <w:rPr>
+          <w:color w:val="4D4D4D"/>
+          <w:highlight w:val="yellow"/>
+        </w:rPr>
+        <w:t>the</w:t>
+      </w:r>
+      <w:r>
+        <w:rPr>
+          <w:color w:val="4D4D4D"/>
+        </w:rPr>
+        <w:t xml:space="preserve"> </w:t>
+      </w:r>
+      <w:r>
+        <w:rPr>
+          <w:color w:val="4D4D4D"/>
+          <w:highlight w:val="yellow"/>
+        </w:rPr>
+        <w:t>cumulative</w:t>
+      </w:r>
+      <w:r>
+        <w:rPr>
+          <w:color w:val="4D4D4D"/>
+        </w:rPr>
+        <w:t xml:space="preserve"> usage</w:t>
+      </w:r>
+      <w:r>
+        <w:rPr>
+          <w:color w:val="4D4D4D"/>
+          <w:highlight w:val="yellow"/>
+        </w:rPr>
+        <w:t xml:space="preserve"> index, indicating greater dominance by the most-used motifs</w:t>
       </w:r>
       <w:r>
         <w:rPr>
@@ -19237,100 +19354,6 @@
           <w:bCs/>
           <w:color w:val="4D4D4D"/>
         </w:rPr>
-        <w:t>F</w:t>
-      </w:r>
-      <w:r>
-        <w:rPr>
-          <w:color w:val="4D4D4D"/>
-        </w:rPr>
-        <w:t xml:space="preserve">. Boxplot of the Shannon diversity index (mean ± SEM). No difference between groups. </w:t>
-      </w:r>
-      <w:r>
-        <w:rPr>
-          <w:b/>
-          <w:bCs/>
-          <w:color w:val="4D4D4D"/>
-        </w:rPr>
-        <w:t>G</w:t>
-      </w:r>
-      <w:r>
-        <w:rPr>
-          <w:color w:val="4D4D4D"/>
-        </w:rPr>
-        <w:t xml:space="preserve">. Boxplot of the evenness index (mean ± SEM). Evenness is comparable across groups. </w:t>
-      </w:r>
-      <w:r>
-        <w:rPr>
-          <w:b/>
-          <w:bCs/>
-          <w:color w:val="4D4D4D"/>
-        </w:rPr>
-        <w:t>H</w:t>
-      </w:r>
-      <w:r>
-        <w:rPr>
-          <w:color w:val="4D4D4D"/>
-        </w:rPr>
-        <w:t xml:space="preserve">. Boxplot of the cumulative usage index (mean ± SEM). ELS </w:t>
-      </w:r>
-      <w:r>
-        <w:rPr>
-          <w:color w:val="4D4D4D"/>
-          <w:highlight w:val="yellow"/>
-        </w:rPr>
-        <w:t>increased</w:t>
-      </w:r>
-      <w:r>
-        <w:rPr>
-          <w:color w:val="4D4D4D"/>
-        </w:rPr>
-        <w:t xml:space="preserve"> </w:t>
-      </w:r>
-      <w:r>
-        <w:rPr>
-          <w:color w:val="4D4D4D"/>
-          <w:highlight w:val="yellow"/>
-        </w:rPr>
-        <w:t>the</w:t>
-      </w:r>
-      <w:r>
-        <w:rPr>
-          <w:color w:val="4D4D4D"/>
-        </w:rPr>
-        <w:t xml:space="preserve"> </w:t>
-      </w:r>
-      <w:r>
-        <w:rPr>
-          <w:color w:val="4D4D4D"/>
-          <w:highlight w:val="yellow"/>
-        </w:rPr>
-        <w:t>cumulative</w:t>
-      </w:r>
-      <w:r>
-        <w:rPr>
-          <w:color w:val="4D4D4D"/>
-        </w:rPr>
-        <w:t xml:space="preserve"> usage</w:t>
-      </w:r>
-      <w:r>
-        <w:rPr>
-          <w:color w:val="4D4D4D"/>
-          <w:highlight w:val="yellow"/>
-        </w:rPr>
-        <w:t xml:space="preserve"> index, indicating greater dominance by the most-used motifs</w:t>
-      </w:r>
-      <w:r>
-        <w:rPr>
-          <w:color w:val="4D4D4D"/>
-        </w:rPr>
-        <w:t xml:space="preserve">. </w:t>
-      </w:r>
-      <w:r>
-        <w:rPr>
-          <w:b/>
-          <w:bCs/>
-          <w:color w:val="4D4D4D"/>
-        </w:rPr>
         <w:t>I</w:t>
       </w:r>
       <w:r>
@@ -19377,7 +19400,20 @@
         <w:rPr>
           <w:color w:val="4D4D4D"/>
         </w:rPr>
-        <w:t xml:space="preserve"> bout duration (seconds ± SEM). ELS mice freeze in shorter bouts. </w:t>
+        <w:t xml:space="preserve"> bout duration (seconds ± SEM). </w:t>
+      </w:r>
+      <w:r>
+        <w:rPr>
+          <w:color w:val="4D4D4D"/>
+          <w:highlight w:val="green"/>
+        </w:rPr>
+        <w:t>Freeze bout duration did not differ significantly between groups.</w:t>
+      </w:r>
+      <w:r>
+        <w:rPr>
+          <w:color w:val="4D4D4D"/>
+        </w:rPr>
+        <w:t xml:space="preserve"> </w:t>
       </w:r>
       <w:r>
         <w:rPr>
@@ -19517,33 +19553,37 @@
         <w:rPr>
           <w:color w:val="4D4D4D"/>
         </w:rPr>
-        <w:t xml:space="preserve">. Boxplot of recurrence rate (mean ± SEM). ELS </w:t>
-      </w:r>
-      <w:r>
-        <w:rPr>
-          <w:color w:val="4D4D4D"/>
-          <w:highlight w:val="yellow"/>
-        </w:rPr>
-        <w:t>showed a trend toward higher</w:t>
-      </w:r>
-      <w:r>
-        <w:rPr>
-          <w:color w:val="4D4D4D"/>
-        </w:rPr>
-        <w:t xml:space="preserve"> recurrence</w:t>
-      </w:r>
-      <w:r>
-        <w:rPr>
-          <w:color w:val="4D4D4D"/>
-          <w:highlight w:val="yellow"/>
-        </w:rPr>
-        <w:t xml:space="preserve"> (p = 0.056)</w:t>
-      </w:r>
-      <w:r>
-        <w:rPr>
-          <w:color w:val="4D4D4D"/>
-        </w:rPr>
-        <w:t xml:space="preserve">. </w:t>
+        <w:t xml:space="preserve">. Boxplot of recurrence rate (mean ± SEM). </w:t>
+      </w:r>
+      <w:r>
+        <w:rPr>
+          <w:color w:val="4D4D4D"/>
+          <w:highlight w:val="green"/>
+        </w:rPr>
+        <w:t>ELS showed a trend toward higher recurrence (p = 0.058).</w:t>
+      </w:r>
+      <w:r>
+        <w:rPr>
+          <w:color w:val="4D4D4D"/>
+          <w:highlight w:val="yellow"/>
+        </w:rPr>
+      </w:r>
+      <w:r>
+        <w:rPr>
+          <w:color w:val="4D4D4D"/>
+        </w:rPr>
+      </w:r>
+      <w:r>
+        <w:rPr>
+          <w:color w:val="4D4D4D"/>
+          <w:highlight w:val="yellow"/>
+        </w:rPr>
+      </w:r>
+      <w:r>
+        <w:rPr>
+          <w:color w:val="4D4D4D"/>
+        </w:rPr>
+        <w:t xml:space="preserve"> </w:t>
       </w:r>
       <w:r>
         <w:rPr>
@@ -19557,7 +19597,20 @@
         <w:rPr>
           <w:color w:val="4D4D4D"/>
         </w:rPr>
-        <w:t xml:space="preserve">. Boxplot of determinism index (mean ± SEM). ELS enhances determinism. </w:t>
+        <w:t xml:space="preserve">. Boxplot of determinism index (mean ± SEM). </w:t>
+      </w:r>
+      <w:r>
+        <w:rPr>
+          <w:color w:val="4D4D4D"/>
+          <w:highlight w:val="green"/>
+        </w:rPr>
+        <w:t>ELS showed a trend toward higher determinism (p = 0.075).</w:t>
+      </w:r>
+      <w:r>
+        <w:rPr>
+          <w:color w:val="4D4D4D"/>
+        </w:rPr>
+        <w:t xml:space="preserve"> </w:t>
       </w:r>
       <w:r>
         <w:rPr>
@@ -19817,7 +19870,20 @@
         <w:rPr>
           <w:color w:val="4D4D4D"/>
         </w:rPr>
-        <w:t xml:space="preserve">. Lineplots showing locomotion (mean % ± SEM) over time during FC in control, ELS, and resilient ELS animals. ELS mice showed locomotion suppression during shocks that was absent in resilient animals. </w:t>
+        <w:t xml:space="preserve">. Lineplots showing locomotion (mean % ± SEM) over time during FC in control, ELS, and resilient ELS animals. </w:t>
+      </w:r>
+      <w:r>
+        <w:rPr>
+          <w:color w:val="4D4D4D"/>
+          <w:highlight w:val="green"/>
+        </w:rPr>
+        <w:t>Locomotion declined more steeply over the session in controls than in vulnerable ELS mice; resilient animals did not differ significantly from either group.</w:t>
+      </w:r>
+      <w:r>
+        <w:rPr>
+          <w:color w:val="4D4D4D"/>
+        </w:rPr>
+        <w:t xml:space="preserve"> </w:t>
       </w:r>
       <w:r>
         <w:rPr>
@@ -20433,7 +20499,20 @@
         <w:rPr>
           <w:color w:val="4D4D4D"/>
         </w:rPr>
-        <w:t xml:space="preserve">. Boxplot of the Lempel-Ziv complexity index (mean ± SEM). When analyzed as a subgroup, vulnerable ELS mice show reduced behavioral complexity compared to controls. </w:t>
+        <w:t xml:space="preserve">. Boxplot of the Lempel-Ziv complexity index (mean ± SEM). </w:t>
+      </w:r>
+      <w:r>
+        <w:rPr>
+          <w:color w:val="4D4D4D"/>
+          <w:highlight w:val="green"/>
+        </w:rPr>
+        <w:t>When analyzed as a subgroup, vulnerable ELS mice show a trend toward reduced behavioral complexity compared to controls (p = 0.086).</w:t>
+      </w:r>
+      <w:r>
+        <w:rPr>
+          <w:color w:val="4D4D4D"/>
+        </w:rPr>
+        <w:t xml:space="preserve"> </w:t>
       </w:r>
       <w:r>
         <w:rPr>
@@ -20547,26 +20626,30 @@
           <w:color w:val="4D4D4D"/>
           <w:highlight w:val="yellow"/>
         </w:rPr>
-        <w:t>Vulnerable</w:t>
-      </w:r>
-      <w:r>
-        <w:rPr>
-          <w:color w:val="4D4D4D"/>
-        </w:rPr>
-        <w:t xml:space="preserve"> ELS animals show lower Markov entropy than controls</w:t>
-      </w:r>
-      <w:r>
-        <w:rPr>
-          <w:color w:val="4D4D4D"/>
-          <w:highlight w:val="yellow"/>
-        </w:rPr>
-        <w:t>; resilient mice do not differ significantly from either group</w:t>
-      </w:r>
-      <w:r>
-        <w:rPr>
-          <w:color w:val="4D4D4D"/>
-        </w:rPr>
-        <w:t>. N</w:t>
+      </w:r>
+      <w:r>
+        <w:rPr>
+          <w:color w:val="4D4D4D"/>
+          <w:highlight w:val="green"/>
+        </w:rPr>
+        <w:t>Markov entropy did not differ significantly across groups.</w:t>
+      </w:r>
+      <w:r>
+        <w:rPr>
+          <w:color w:val="4D4D4D"/>
+        </w:rPr>
+      </w:r>
+      <w:r>
+        <w:rPr>
+          <w:color w:val="4D4D4D"/>
+          <w:highlight w:val="yellow"/>
+        </w:rPr>
+      </w:r>
+      <w:r>
+        <w:rPr>
+          <w:color w:val="4D4D4D"/>
+        </w:rPr>
+        <w:t xml:space="preserve"> N</w:t>
       </w:r>
       <w:r>
         <w:rPr>
@@ -21642,32 +21725,433 @@
         <w:spacing w:after="240" w:line="276" w:lineRule="auto"/>
         <w:jc w:val="both"/>
         <w:rPr>
-          <w:color w:val="4D4D4D"/>
-        </w:rPr>
-      </w:pPr>
-      <w:r>
-        <w:rPr>
-          <w:b/>
-          <w:bCs/>
-          <w:color w:val="4D4D4D"/>
-        </w:rPr>
-        <w:t>Supplementary Fig</w:t>
-      </w:r>
-      <w:r>
-        <w:rPr>
-          <w:b/>
-          <w:bCs/>
-          <w:color w:val="4D4D4D"/>
+          <w:b/>
+          <w:bCs/>
+          <w:color w:val="4D4D4D"/>
+        </w:rPr>
+      </w:pPr>
+      <w:r>
+        <w:rPr>
+          <w:b w:val="0"/>
+        </w:rPr>
+      </w:r>
+      <w:r>
+        <w:rPr>
+          <w:b w:val="0"/>
+          <w:highlight w:val="green"/>
+        </w:rPr>
+        <w:t>Supplementary Fig. 4. Class-specific SHAP beeswarm plots</w:t>
+      </w:r>
+      <w:r>
+        <w:rPr>
+          <w:b w:val="0"/>
+          <w:highlight w:val="yellow"/>
+        </w:rPr>
+        <w:t xml:space="preserve"> for </w:t>
+      </w:r>
+      <w:r>
+        <w:rPr>
+          <w:b w:val="0"/>
+        </w:rPr>
+        <w:t xml:space="preserve">A. </w:t>
+      </w:r>
+      <w:r>
+        <w:rPr>
+          <w:b w:val="0"/>
+          <w:highlight w:val="yellow"/>
+        </w:rPr>
+        <w:t>Freeze</w:t>
+      </w:r>
+      <w:r>
+        <w:rPr>
+          <w:b w:val="0"/>
+        </w:rPr>
+        <w:t xml:space="preserve">, B. </w:t>
+      </w:r>
+      <w:r>
+        <w:rPr>
+          <w:b w:val="0"/>
+          <w:highlight w:val="yellow"/>
+        </w:rPr>
+        <w:t>Sniff</w:t>
+      </w:r>
+      <w:r>
+        <w:rPr>
+          <w:b w:val="0"/>
+        </w:rPr>
+        <w:t xml:space="preserve">, C. </w:t>
+      </w:r>
+      <w:r>
+        <w:rPr>
+          <w:b w:val="0"/>
+          <w:highlight w:val="yellow"/>
+        </w:rPr>
+        <w:t>Groom</w:t>
+      </w:r>
+      <w:r>
+        <w:rPr>
+          <w:b w:val="0"/>
+        </w:rPr>
+        <w:t xml:space="preserve">, D. </w:t>
+      </w:r>
+      <w:r>
+        <w:rPr>
+          <w:b w:val="0"/>
+          <w:highlight w:val="yellow"/>
+        </w:rPr>
+        <w:t>Turn</w:t>
+      </w:r>
+      <w:r>
+        <w:rPr>
+          <w:b w:val="0"/>
+        </w:rPr>
+        <w:t xml:space="preserve">, E. </w:t>
+      </w:r>
+      <w:r>
+        <w:rPr>
+          <w:b w:val="0"/>
+          <w:highlight w:val="yellow"/>
+        </w:rPr>
+        <w:t>Locomotion</w:t>
+      </w:r>
+      <w:r>
+        <w:rPr>
+          <w:b w:val="0"/>
+        </w:rPr>
+        <w:t xml:space="preserve">, F. </w:t>
+      </w:r>
+      <w:r>
+        <w:rPr>
+          <w:b w:val="0"/>
+          <w:highlight w:val="yellow"/>
+        </w:rPr>
+        <w:t>Climb</w:t>
+      </w:r>
+      <w:r>
+        <w:rPr>
+          <w:b w:val="0"/>
+        </w:rPr>
+        <w:t xml:space="preserve">, G. </w:t>
+      </w:r>
+      <w:r>
+        <w:rPr>
+          <w:b w:val="0"/>
+          <w:highlight w:val="yellow"/>
+        </w:rPr>
+        <w:t>Jump</w:t>
+      </w:r>
+      <w:r>
+        <w:rPr>
+          <w:b w:val="0"/>
+        </w:rPr>
+        <w:t xml:space="preserve">, </w:t>
+      </w:r>
+      <w:r>
+        <w:rPr>
+          <w:b w:val="0"/>
+          <w:highlight w:val="yellow"/>
+        </w:rPr>
+        <w:t>and</w:t>
+      </w:r>
+      <w:r>
+        <w:rPr>
+          <w:b w:val="0"/>
+        </w:rPr>
+        <w:t xml:space="preserve"> H. </w:t>
+      </w:r>
+      <w:r>
+        <w:rPr>
+          <w:b w:val="0"/>
+          <w:highlight w:val="yellow"/>
+        </w:rPr>
+        <w:t>Unassigned</w:t>
+      </w:r>
+      <w:r>
+        <w:rPr>
+          <w:b w:val="0"/>
+        </w:rPr>
+        <w:t xml:space="preserve"> </w:t>
+      </w:r>
+      <w:r>
+        <w:rPr>
+          <w:b w:val="0"/>
+          <w:highlight w:val="yellow"/>
+        </w:rPr>
+        <w:t>predictions.</w:t>
+      </w:r>
+      <w:r>
+        <w:rPr>
+          <w:b w:val="0"/>
+        </w:rPr>
+        <w:t xml:space="preserve"> </w:t>
+      </w:r>
+      <w:r>
+        <w:rPr>
+          <w:b w:val="0"/>
+          <w:highlight w:val="yellow"/>
+        </w:rPr>
+        <w:t>Each panel shows the 10 highest-ranked features</w:t>
+      </w:r>
+      <w:r>
+        <w:rPr>
+          <w:b w:val="0"/>
+        </w:rPr>
+        <w:t xml:space="preserve"> for </w:t>
+      </w:r>
+      <w:r>
+        <w:rPr>
+          <w:b w:val="0"/>
+          <w:highlight w:val="yellow"/>
+        </w:rPr>
+        <w:t>that</w:t>
+      </w:r>
+      <w:r>
+        <w:rPr>
+          <w:b w:val="0"/>
+        </w:rPr>
+        <w:t xml:space="preserve"> </w:t>
+      </w:r>
+      <w:r>
+        <w:rPr>
+          <w:b w:val="0"/>
+          <w:highlight w:val="yellow"/>
+        </w:rPr>
+        <w:t>class</w:t>
+      </w:r>
+      <w:r>
+        <w:rPr>
+          <w:b w:val="0"/>
+        </w:rPr>
+        <w:t xml:space="preserve"> </w:t>
+      </w:r>
+      <w:r>
+        <w:rPr>
+          <w:b w:val="0"/>
+          <w:highlight w:val="yellow"/>
+        </w:rPr>
+        <w:t>from</w:t>
+      </w:r>
+      <w:r>
+        <w:rPr>
+          <w:b w:val="0"/>
+        </w:rPr>
+        <w:t xml:space="preserve"> the </w:t>
+      </w:r>
+      <w:r>
+        <w:rPr>
+          <w:b w:val="0"/>
+          <w:highlight w:val="yellow"/>
+        </w:rPr>
+        <w:t>719-parameter legacy classifier. Each point represents one</w:t>
+      </w:r>
+      <w:r>
+        <w:rPr>
+          <w:b w:val="0"/>
+        </w:rPr>
+        <w:t xml:space="preserve"> of </w:t>
+      </w:r>
+      <w:r>
+        <w:rPr>
+          <w:b w:val="0"/>
+          <w:highlight w:val="yellow"/>
+        </w:rPr>
+        <w:t>2,638</w:t>
+      </w:r>
+      <w:r>
+        <w:rPr>
+          <w:b w:val="0"/>
+        </w:rPr>
+        <w:t xml:space="preserve"> </w:t>
+      </w:r>
+      <w:r>
+        <w:rPr>
+          <w:b w:val="0"/>
+          <w:highlight w:val="yellow"/>
+        </w:rPr>
+        <w:t>sampled</w:t>
+      </w:r>
+      <w:r>
+        <w:rPr>
+          <w:b w:val="0"/>
+        </w:rPr>
+        <w:t xml:space="preserve"> </w:t>
+      </w:r>
+      <w:r>
+        <w:rPr>
+          <w:b w:val="0"/>
+          <w:highlight w:val="yellow"/>
+        </w:rPr>
+        <w:t>frames;</w:t>
+      </w:r>
+      <w:r>
+        <w:rPr>
+          <w:b w:val="0"/>
+        </w:rPr>
+        <w:t xml:space="preserve"> </w:t>
+      </w:r>
+      <w:r>
+        <w:rPr>
+          <w:b w:val="0"/>
+          <w:highlight w:val="yellow"/>
+        </w:rPr>
+        <w:t>horizontal</w:t>
+      </w:r>
+      <w:r>
+        <w:rPr>
+          <w:b w:val="0"/>
+        </w:rPr>
+        <w:t xml:space="preserve"> </w:t>
+      </w:r>
+      <w:r>
+        <w:rPr>
+          <w:b w:val="0"/>
+          <w:highlight w:val="yellow"/>
+        </w:rPr>
+        <w:t>position</w:t>
+      </w:r>
+      <w:r>
+        <w:rPr>
+          <w:b w:val="0"/>
+        </w:rPr>
+        <w:t xml:space="preserve"> </w:t>
+      </w:r>
+      <w:r>
+        <w:rPr>
+          <w:b w:val="0"/>
+          <w:highlight w:val="yellow"/>
+        </w:rPr>
+        <w:t>is</w:t>
+      </w:r>
+      <w:r>
+        <w:rPr>
+          <w:b w:val="0"/>
+        </w:rPr>
+        <w:t xml:space="preserve"> the </w:t>
+      </w:r>
+      <w:r>
+        <w:rPr>
+          <w:b w:val="0"/>
+          <w:highlight w:val="yellow"/>
+        </w:rPr>
+        <w:t>SHAP</w:t>
+      </w:r>
+      <w:r>
+        <w:rPr>
+          <w:b w:val="0"/>
+        </w:rPr>
+        <w:t xml:space="preserve"> </w:t>
+      </w:r>
+      <w:r>
+        <w:rPr>
+          <w:b w:val="0"/>
+          <w:highlight w:val="yellow"/>
+        </w:rPr>
+        <w:t>contribution</w:t>
+      </w:r>
+      <w:r>
+        <w:rPr>
+          <w:b w:val="0"/>
+        </w:rPr>
+        <w:t xml:space="preserve"> to </w:t>
+      </w:r>
+      <w:r>
+        <w:rPr>
+          <w:b w:val="0"/>
+          <w:highlight w:val="yellow"/>
+        </w:rPr>
+        <w:t>the</w:t>
+      </w:r>
+      <w:r>
+        <w:rPr>
+          <w:b w:val="0"/>
+        </w:rPr>
+        <w:t xml:space="preserve"> </w:t>
+      </w:r>
+      <w:r>
+        <w:rPr>
+          <w:b w:val="0"/>
+          <w:highlight w:val="yellow"/>
+        </w:rPr>
+        <w:t>class output, and color encodes</w:t>
+      </w:r>
+      <w:r>
+        <w:rPr>
+          <w:b w:val="0"/>
+        </w:rPr>
+        <w:t xml:space="preserve"> the </w:t>
+      </w:r>
+      <w:r>
+        <w:rPr>
+          <w:b w:val="0"/>
+          <w:highlight w:val="yellow"/>
+        </w:rPr>
+        <w:t>observed</w:t>
+      </w:r>
+      <w:r>
+        <w:rPr>
+          <w:b w:val="0"/>
+        </w:rPr>
+        <w:t xml:space="preserve"> </w:t>
+      </w:r>
+      <w:r>
+        <w:rPr>
+          <w:b w:val="0"/>
+          <w:highlight w:val="yellow"/>
+        </w:rPr>
+        <w:t>feature value (red, low; blue, high)</w:t>
+      </w:r>
+      <w:r>
+        <w:rPr>
+          <w:b w:val="0"/>
         </w:rPr>
         <w:t>.</w:t>
       </w:r>
       <w:r>
         <w:rPr>
-          <w:b/>
-          <w:bCs/>
-          <w:color w:val="4D4D4D"/>
-        </w:rPr>
-        <w:t xml:space="preserve"> 4. Convex-hull floor-overlap metric allows for climbing identification missed by keypoint MoSeq</w:t>
+          <w:b w:val="0"/>
+          <w:highlight w:val="yellow"/>
+        </w:rPr>
+        <w:t xml:space="preserve"> The vertical line marks zero contribution.</w:t>
+      </w:r>
+    </w:p>
+    <w:p>
+      <w:pPr>
+        <w:spacing w:after="240" w:line="276" w:lineRule="auto"/>
+        <w:jc w:val="both"/>
+        <w:rPr>
+          <w:color w:val="4D4D4D"/>
+        </w:rPr>
+      </w:pPr>
+      <w:r>
+        <w:rPr>
+          <w:b/>
+          <w:bCs/>
+          <w:color w:val="4D4D4D"/>
+        </w:rPr>
+      </w:r>
+      <w:r>
+        <w:rPr>
+          <w:b/>
+          <w:bCs/>
+          <w:color w:val="4D4D4D"/>
+          <w:highlight w:val="green"/>
+        </w:rPr>
+        <w:t>Supplementary Fig. 5. Convex-hull floor-overlap metric</w:t>
+      </w:r>
+      <w:r>
+        <w:rPr>
+          <w:b/>
+          <w:bCs/>
+          <w:color w:val="4D4D4D"/>
+        </w:rPr>
+      </w:r>
+      <w:r>
+        <w:rPr>
+          <w:b/>
+          <w:bCs/>
+          <w:color w:val="4D4D4D"/>
+        </w:rPr>
+        <w:t xml:space="preserve"> allows for climbing identification missed by keypoint MoSeq</w:t>
       </w:r>
       <w:r>
         <w:rPr>
@@ -21681,394 +22165,6 @@
         </w:rPr>
         <w:lastRenderedPageBreak/>
         <w:t>walls (mauve). The convex hull of the animal’s DeepLabCut keypoints is overlaid in dark purple. Numbers above each frame report the proportion of hull area on the floor and on the walls. As the mouse ascends the wall the hull shifts upward, floor overlap falls below 0.8, and wall overlap rises, flagging a climbing episode that keypoint MoSeq alone could not label reliably.</w:t>
-      </w:r>
-    </w:p>
-    <w:p>
-      <w:pPr>
-        <w:spacing w:after="240" w:line="276" w:lineRule="auto"/>
-        <w:jc w:val="both"/>
-        <w:rPr>
-          <w:b/>
-          <w:bCs/>
-          <w:color w:val="4D4D4D"/>
-        </w:rPr>
-      </w:pPr>
-      <w:r>
-        <w:rPr>
-          <w:b w:val="0"/>
-        </w:rPr>
-        <w:t xml:space="preserve">Supplementary Fig. 5. </w:t>
-      </w:r>
-      <w:r>
-        <w:rPr>
-          <w:b w:val="0"/>
-          <w:highlight w:val="yellow"/>
-        </w:rPr>
-        <w:t xml:space="preserve">Class-specific SHAP beeswarm plots for </w:t>
-      </w:r>
-      <w:r>
-        <w:rPr>
-          <w:b w:val="0"/>
-        </w:rPr>
-        <w:t xml:space="preserve">A. </w:t>
-      </w:r>
-      <w:r>
-        <w:rPr>
-          <w:b w:val="0"/>
-          <w:highlight w:val="yellow"/>
-        </w:rPr>
-        <w:t>Freeze</w:t>
-      </w:r>
-      <w:r>
-        <w:rPr>
-          <w:b w:val="0"/>
-        </w:rPr>
-        <w:t xml:space="preserve">, B. </w:t>
-      </w:r>
-      <w:r>
-        <w:rPr>
-          <w:b w:val="0"/>
-          <w:highlight w:val="yellow"/>
-        </w:rPr>
-        <w:t>Sniff</w:t>
-      </w:r>
-      <w:r>
-        <w:rPr>
-          <w:b w:val="0"/>
-        </w:rPr>
-        <w:t xml:space="preserve">, C. </w:t>
-      </w:r>
-      <w:r>
-        <w:rPr>
-          <w:b w:val="0"/>
-          <w:highlight w:val="yellow"/>
-        </w:rPr>
-        <w:t>Groom</w:t>
-      </w:r>
-      <w:r>
-        <w:rPr>
-          <w:b w:val="0"/>
-        </w:rPr>
-        <w:t xml:space="preserve">, D. </w:t>
-      </w:r>
-      <w:r>
-        <w:rPr>
-          <w:b w:val="0"/>
-          <w:highlight w:val="yellow"/>
-        </w:rPr>
-        <w:t>Turn</w:t>
-      </w:r>
-      <w:r>
-        <w:rPr>
-          <w:b w:val="0"/>
-        </w:rPr>
-        <w:t xml:space="preserve">, E. </w:t>
-      </w:r>
-      <w:r>
-        <w:rPr>
-          <w:b w:val="0"/>
-          <w:highlight w:val="yellow"/>
-        </w:rPr>
-        <w:t>Locomotion</w:t>
-      </w:r>
-      <w:r>
-        <w:rPr>
-          <w:b w:val="0"/>
-        </w:rPr>
-        <w:t xml:space="preserve">, F. </w:t>
-      </w:r>
-      <w:r>
-        <w:rPr>
-          <w:b w:val="0"/>
-          <w:highlight w:val="yellow"/>
-        </w:rPr>
-        <w:t>Climb</w:t>
-      </w:r>
-      <w:r>
-        <w:rPr>
-          <w:b w:val="0"/>
-        </w:rPr>
-        <w:t xml:space="preserve">, G. </w:t>
-      </w:r>
-      <w:r>
-        <w:rPr>
-          <w:b w:val="0"/>
-          <w:highlight w:val="yellow"/>
-        </w:rPr>
-        <w:t>Jump</w:t>
-      </w:r>
-      <w:r>
-        <w:rPr>
-          <w:b w:val="0"/>
-        </w:rPr>
-        <w:t xml:space="preserve">, </w:t>
-      </w:r>
-      <w:r>
-        <w:rPr>
-          <w:b w:val="0"/>
-          <w:highlight w:val="yellow"/>
-        </w:rPr>
-        <w:t>and</w:t>
-      </w:r>
-      <w:r>
-        <w:rPr>
-          <w:b w:val="0"/>
-        </w:rPr>
-        <w:t xml:space="preserve"> H. </w:t>
-      </w:r>
-      <w:r>
-        <w:rPr>
-          <w:b w:val="0"/>
-          <w:highlight w:val="yellow"/>
-        </w:rPr>
-        <w:t>Unassigned</w:t>
-      </w:r>
-      <w:r>
-        <w:rPr>
-          <w:b w:val="0"/>
-        </w:rPr>
-        <w:t xml:space="preserve"> </w:t>
-      </w:r>
-      <w:r>
-        <w:rPr>
-          <w:b w:val="0"/>
-          <w:highlight w:val="yellow"/>
-        </w:rPr>
-        <w:t>predictions.</w:t>
-      </w:r>
-      <w:r>
-        <w:rPr>
-          <w:b w:val="0"/>
-        </w:rPr>
-        <w:t xml:space="preserve"> </w:t>
-      </w:r>
-      <w:r>
-        <w:rPr>
-          <w:b w:val="0"/>
-          <w:highlight w:val="yellow"/>
-        </w:rPr>
-        <w:t>Each panel shows the 10 highest-ranked features</w:t>
-      </w:r>
-      <w:r>
-        <w:rPr>
-          <w:b w:val="0"/>
-        </w:rPr>
-        <w:t xml:space="preserve"> for </w:t>
-      </w:r>
-      <w:r>
-        <w:rPr>
-          <w:b w:val="0"/>
-          <w:highlight w:val="yellow"/>
-        </w:rPr>
-        <w:t>that</w:t>
-      </w:r>
-      <w:r>
-        <w:rPr>
-          <w:b w:val="0"/>
-        </w:rPr>
-        <w:t xml:space="preserve"> </w:t>
-      </w:r>
-      <w:r>
-        <w:rPr>
-          <w:b w:val="0"/>
-          <w:highlight w:val="yellow"/>
-        </w:rPr>
-        <w:t>class</w:t>
-      </w:r>
-      <w:r>
-        <w:rPr>
-          <w:b w:val="0"/>
-        </w:rPr>
-        <w:t xml:space="preserve"> </w:t>
-      </w:r>
-      <w:r>
-        <w:rPr>
-          <w:b w:val="0"/>
-          <w:highlight w:val="yellow"/>
-        </w:rPr>
-        <w:t>from</w:t>
-      </w:r>
-      <w:r>
-        <w:rPr>
-          <w:b w:val="0"/>
-        </w:rPr>
-        <w:t xml:space="preserve"> the </w:t>
-      </w:r>
-      <w:r>
-        <w:rPr>
-          <w:b w:val="0"/>
-          <w:highlight w:val="yellow"/>
-        </w:rPr>
-        <w:t>719-parameter legacy classifier. Each point represents one</w:t>
-      </w:r>
-      <w:r>
-        <w:rPr>
-          <w:b w:val="0"/>
-        </w:rPr>
-        <w:t xml:space="preserve"> of </w:t>
-      </w:r>
-      <w:r>
-        <w:rPr>
-          <w:b w:val="0"/>
-          <w:highlight w:val="yellow"/>
-        </w:rPr>
-        <w:t>2,638</w:t>
-      </w:r>
-      <w:r>
-        <w:rPr>
-          <w:b w:val="0"/>
-        </w:rPr>
-        <w:t xml:space="preserve"> </w:t>
-      </w:r>
-      <w:r>
-        <w:rPr>
-          <w:b w:val="0"/>
-          <w:highlight w:val="yellow"/>
-        </w:rPr>
-        <w:t>sampled</w:t>
-      </w:r>
-      <w:r>
-        <w:rPr>
-          <w:b w:val="0"/>
-        </w:rPr>
-        <w:t xml:space="preserve"> </w:t>
-      </w:r>
-      <w:r>
-        <w:rPr>
-          <w:b w:val="0"/>
-          <w:highlight w:val="yellow"/>
-        </w:rPr>
-        <w:t>frames;</w:t>
-      </w:r>
-      <w:r>
-        <w:rPr>
-          <w:b w:val="0"/>
-        </w:rPr>
-        <w:t xml:space="preserve"> </w:t>
-      </w:r>
-      <w:r>
-        <w:rPr>
-          <w:b w:val="0"/>
-          <w:highlight w:val="yellow"/>
-        </w:rPr>
-        <w:t>horizontal</w:t>
-      </w:r>
-      <w:r>
-        <w:rPr>
-          <w:b w:val="0"/>
-        </w:rPr>
-        <w:t xml:space="preserve"> </w:t>
-      </w:r>
-      <w:r>
-        <w:rPr>
-          <w:b w:val="0"/>
-          <w:highlight w:val="yellow"/>
-        </w:rPr>
-        <w:t>position</w:t>
-      </w:r>
-      <w:r>
-        <w:rPr>
-          <w:b w:val="0"/>
-        </w:rPr>
-        <w:t xml:space="preserve"> </w:t>
-      </w:r>
-      <w:r>
-        <w:rPr>
-          <w:b w:val="0"/>
-          <w:highlight w:val="yellow"/>
-        </w:rPr>
-        <w:t>is</w:t>
-      </w:r>
-      <w:r>
-        <w:rPr>
-          <w:b w:val="0"/>
-        </w:rPr>
-        <w:t xml:space="preserve"> the </w:t>
-      </w:r>
-      <w:r>
-        <w:rPr>
-          <w:b w:val="0"/>
-          <w:highlight w:val="yellow"/>
-        </w:rPr>
-        <w:t>SHAP</w:t>
-      </w:r>
-      <w:r>
-        <w:rPr>
-          <w:b w:val="0"/>
-        </w:rPr>
-        <w:t xml:space="preserve"> </w:t>
-      </w:r>
-      <w:r>
-        <w:rPr>
-          <w:b w:val="0"/>
-          <w:highlight w:val="yellow"/>
-        </w:rPr>
-        <w:t>contribution</w:t>
-      </w:r>
-      <w:r>
-        <w:rPr>
-          <w:b w:val="0"/>
-        </w:rPr>
-        <w:t xml:space="preserve"> to </w:t>
-      </w:r>
-      <w:r>
-        <w:rPr>
-          <w:b w:val="0"/>
-          <w:highlight w:val="yellow"/>
-        </w:rPr>
-        <w:t>the</w:t>
-      </w:r>
-      <w:r>
-        <w:rPr>
-          <w:b w:val="0"/>
-        </w:rPr>
-        <w:t xml:space="preserve"> </w:t>
-      </w:r>
-      <w:r>
-        <w:rPr>
-          <w:b w:val="0"/>
-          <w:highlight w:val="yellow"/>
-        </w:rPr>
-        <w:t>class output, and color encodes</w:t>
-      </w:r>
-      <w:r>
-        <w:rPr>
-          <w:b w:val="0"/>
-        </w:rPr>
-        <w:t xml:space="preserve"> the </w:t>
-      </w:r>
-      <w:r>
-        <w:rPr>
-          <w:b w:val="0"/>
-          <w:highlight w:val="yellow"/>
-        </w:rPr>
-        <w:t>observed</w:t>
-      </w:r>
-      <w:r>
-        <w:rPr>
-          <w:b w:val="0"/>
-        </w:rPr>
-        <w:t xml:space="preserve"> </w:t>
-      </w:r>
-      <w:r>
-        <w:rPr>
-          <w:b w:val="0"/>
-          <w:highlight w:val="yellow"/>
-        </w:rPr>
-        <w:t>feature value (red, low; blue, high)</w:t>
-      </w:r>
-      <w:r>
-        <w:rPr>
-          <w:b w:val="0"/>
-        </w:rPr>
-        <w:t>.</w:t>
-      </w:r>
-      <w:r>
-        <w:rPr>
-          <w:b w:val="0"/>
-          <w:highlight w:val="yellow"/>
-        </w:rPr>
-        <w:t xml:space="preserve"> The vertical line marks zero contribution.</w:t>
       </w:r>
     </w:p>
     <w:p>

</xml_diff>